<commit_message>
Update Optimization and Engineering submission package
</commit_message>
<xml_diff>
--- a/supplementary/Supplementary_Material.docx
+++ b/supplementary/Supplementary_Material.docx
@@ -11,19 +11,13 @@
           <w:color w:val="auto"/>
         </w:rPr>
       </w:pPr>
-      <w:r>
-        <w:rPr>
-          <w:color w:val="auto"/>
-        </w:rPr>
-        <w:t>Suppleme</w:t>
-      </w:r>
       <w:bookmarkStart w:id="0" w:name="_GoBack"/>
       <w:bookmarkEnd w:id="0"/>
       <w:r>
         <w:rPr>
           <w:color w:val="auto"/>
         </w:rPr>
-        <w:t>ntary Material</w:t>
+        <w:t>Supplementary Material</w:t>
       </w:r>
     </w:p>
     <w:p>
@@ -31,7 +25,19 @@
         <w:spacing w:line="480" w:lineRule="auto"/>
       </w:pPr>
       <w:r>
-        <w:t>Public repository: https://github.com/gabrielmontufar/article-114-engineering-optimization-claim-assurance. This repository contains this supplementary Word document, the submitted reproducibility archive, and the public-facing README for the article 114 Engineering Optimization package. Third-party raw datasets are included only when redistribution permission is confirmed; otherwise the repository provides processed validation points, manifests, acquisition notes, and acquisition instructions.</w:t>
+        <w:t xml:space="preserve">Public repository: </w:t>
+      </w:r>
+      <w:r>
+        <w:t>https://github.com/gabrielmontufar/article-114-optimization-and-engineering-claim-admissibility</w:t>
+      </w:r>
+      <w:r>
+        <w:t xml:space="preserve">. This repository contains this supplementary Word document, the submitted reproducibility archive, and the public-facing README for the article 114 Optimization and Engineering package. Third-party raw datasets are included only when redistribution permission is confirmed; otherwise the repository provides </w:t>
+      </w:r>
+      <w:r>
+        <w:t>processed response-support points</w:t>
+      </w:r>
+      <w:r>
+        <w:t>, manifests, acquisition notes, and acquisition instructions.</w:t>
       </w:r>
     </w:p>
     <w:p>
@@ -47,60 +53,15 @@
         <w:spacing w:line="480" w:lineRule="auto"/>
       </w:pPr>
       <w:r>
-        <w:t xml:space="preserve">Gabriel </w:t>
+        <w:t>Gabriel Jesús Montúfar Chiriboga</w:t>
       </w:r>
-      <w:proofErr w:type="spellStart"/>
-      <w:r>
-        <w:t>Jesús</w:t>
-      </w:r>
-      <w:proofErr w:type="spellEnd"/>
-      <w:r>
-        <w:t xml:space="preserve"> </w:t>
-      </w:r>
-      <w:proofErr w:type="spellStart"/>
-      <w:r>
-        <w:t>Montúfar</w:t>
-      </w:r>
-      <w:proofErr w:type="spellEnd"/>
-      <w:r>
-        <w:t xml:space="preserve"> </w:t>
-      </w:r>
-      <w:proofErr w:type="spellStart"/>
-      <w:r>
-        <w:t>Chiriboga</w:t>
-      </w:r>
-      <w:proofErr w:type="spellEnd"/>
     </w:p>
     <w:p>
       <w:pPr>
         <w:spacing w:line="480" w:lineRule="auto"/>
       </w:pPr>
       <w:r>
-        <w:t xml:space="preserve">This file contains only supplementary methods, extended evidence, replication notes, reporting-guide alignment, and the certificate-handoff schema used to connect the optimizer-agnostic encoded-claim layer to future validation workflows. Candidate-level data, figures, executable scripts, run_all_log.txt, cgc_claim_risk_sensitivity.csv, </w:t>
-      </w:r>
-      <w:proofErr w:type="spellStart"/>
-      <w:r>
-        <w:t>cgc_certificate_handoff_schema.json</w:t>
-      </w:r>
-      <w:proofErr w:type="spellEnd"/>
-      <w:r>
-        <w:t xml:space="preserve">, and environment files </w:t>
-      </w:r>
-      <w:proofErr w:type="gramStart"/>
-      <w:r>
-        <w:t>are supplied</w:t>
-      </w:r>
-      <w:proofErr w:type="gramEnd"/>
-      <w:r>
-        <w:t xml:space="preserve"> in the </w:t>
-      </w:r>
-      <w:proofErr w:type="spellStart"/>
-      <w:r>
-        <w:t>supplementary_files</w:t>
-      </w:r>
-      <w:proofErr w:type="spellEnd"/>
-      <w:r>
-        <w:t xml:space="preserve"> directory and its clean ZIP package.</w:t>
+        <w:t>This file contains only supplementary methods, extended evidence, replication notes, reporting-guide alignment, and the certificate-handoff schema used to connect the optimizer-agnostic encoded-claim layer to future validation workflows. Candidate-level data, figures, executable scripts, run_all_log.txt, cgc_claim_risk_sensitivity.csv, cgc_certificate_handoff_schema.json, and environment files are supplied in the supplementary_files directory and its clean ZIP package.</w:t>
       </w:r>
     </w:p>
     <w:p>
@@ -131,19 +92,11 @@
         <w:spacing w:line="480" w:lineRule="auto"/>
       </w:pPr>
       <w:r>
-        <w:t xml:space="preserve">A candidate x supports an encoded-compliance claim only when every encoded residual is non-positive within tolerance, catalog membership is valid, and the solver/enumeration status is recorded. If any condition is absent, the supported statement </w:t>
-      </w:r>
-      <w:proofErr w:type="gramStart"/>
-      <w:r>
-        <w:t>is downgraded</w:t>
-      </w:r>
-      <w:proofErr w:type="gramEnd"/>
-      <w:r>
-        <w:t xml:space="preserve"> to an optimization-result claim or an </w:t>
+        <w:t xml:space="preserve">A candidate x supports an encoded-compliance claim only when every encoded residual is non-positive within tolerance, catalog membership is valid, and the solver/enumeration status is recorded. If any </w:t>
       </w:r>
       <w:r>
         <w:lastRenderedPageBreak/>
-        <w:t>unresolved-claim record.</w:t>
+        <w:t>condition is absent, the supported statement is downgraded to an optimization-result claim or an unresolved-claim record.</w:t>
       </w:r>
       <w:r>
         <w:t xml:space="preserve"> </w:t>
@@ -460,23 +413,7 @@
                 <w:color w:val="000000"/>
                 <w:sz w:val="18"/>
               </w:rPr>
-              <w:t xml:space="preserve">Explicit </w:t>
-            </w:r>
-            <w:proofErr w:type="spellStart"/>
-            <w:r>
-              <w:rPr>
-                <w:color w:val="000000"/>
-                <w:sz w:val="18"/>
-              </w:rPr>
-              <w:t>unencoded</w:t>
-            </w:r>
-            <w:proofErr w:type="spellEnd"/>
-            <w:r>
-              <w:rPr>
-                <w:color w:val="000000"/>
-                <w:sz w:val="18"/>
-              </w:rPr>
-              <w:t xml:space="preserve"> requirements</w:t>
+              <w:t>Explicit unencoded requirements</w:t>
             </w:r>
           </w:p>
         </w:tc>
@@ -520,29 +457,27 @@
         <w:spacing w:line="480" w:lineRule="auto"/>
       </w:pPr>
       <w:r>
-        <w:t xml:space="preserve">The benchmark suite </w:t>
-      </w:r>
-      <w:proofErr w:type="gramStart"/>
-      <w:r>
-        <w:t>is split</w:t>
-      </w:r>
-      <w:proofErr w:type="gramEnd"/>
-      <w:r>
-        <w:t xml:space="preserve"> between the manuscript summary and machine-readable files. The complete candidate tables </w:t>
-      </w:r>
-      <w:proofErr w:type="gramStart"/>
-      <w:r>
-        <w:t>are intentionally kept</w:t>
-      </w:r>
-      <w:proofErr w:type="gramEnd"/>
-      <w:r>
-        <w:t xml:space="preserve"> as CSV files to avoid unreadable multi-column tables in the Word/PDF submission.</w:t>
+        <w:t>The benchmark suite is split between the manuscript summary and machine-readable files. The complete candidate tables are intentionally kept as CSV files to avoid unreadable multi-column tables in the Word/PDF submission.</w:t>
       </w:r>
       <w:r>
         <w:t xml:space="preserve"> </w:t>
       </w:r>
       <w:r>
         <w:t>Table S2 lists the benchmark files used in the supplementary package, their validation role, and the main output produced by each file.</w:t>
+      </w:r>
+    </w:p>
+    <w:p>
+      <w:pPr>
+        <w:pStyle w:val="SupplementaryTableCaption"/>
+      </w:pPr>
+      <w:r>
+        <w:t xml:space="preserve">The file cgc_operator_property_examples.csv provides a compact index of benchmark-level examples for the post-optimization admissibility operator properties used in the manuscript: missing-evidence blocking, </w:t>
+      </w:r>
+      <w:r>
+        <w:t>compatible-evidence monotonicity and contradictory-evidence downgrade</w:t>
+      </w:r>
+      <w:r>
+        <w:t>, idempotence for an unchanged evidence record, and scope monotonicity. It is an index over existing benchmark outputs rather than a new structural validation result.</w:t>
       </w:r>
     </w:p>
     <w:p>
@@ -835,7 +770,6 @@
                 <w:color w:val="000000"/>
                 <w:sz w:val="18"/>
               </w:rPr>
-              <w:lastRenderedPageBreak/>
               <w:t>cgc_opensees_blind_crosscheck.py / .csv</w:t>
             </w:r>
           </w:p>
@@ -1021,23 +955,7 @@
         <w:spacing w:line="480" w:lineRule="auto"/>
       </w:pPr>
       <w:r>
-        <w:t xml:space="preserve">Penalty-weight sweeps </w:t>
-      </w:r>
-      <w:proofErr w:type="gramStart"/>
-      <w:r>
-        <w:t>are reported</w:t>
-      </w:r>
-      <w:proofErr w:type="gramEnd"/>
-      <w:r>
-        <w:t xml:space="preserve"> to show that penalties can reduce residuals without authorizing encoded-compliance wording. The claim-risk benchmark now uses a deterministic ordinal rule as the primary classification: positive residual or unsupported encoded feasibility yields high claim risk; zero residual plus encoded feasibility but no recorded certificate yields moderate claim risk; zero residual plus encoded feasibility plus recorded enumeration or solver route yields low encoded-claim risk. The numeric score </w:t>
-      </w:r>
-      <w:proofErr w:type="gramStart"/>
-      <w:r>
-        <w:t>is retained</w:t>
-      </w:r>
-      <w:proofErr w:type="gramEnd"/>
-      <w:r>
-        <w:t xml:space="preserve"> only as a secondary audit index, and cgc_claim_risk_sensitivity.csv reports baseline, residual-heavy, certificate-heavy, and feasibility-heavy weight sets.</w:t>
+        <w:t>Penalty-weight sweeps are reported to show that penalties can reduce residuals without authorizing encoded-compliance wording. The claim-risk benchmark now uses a deterministic ordinal rule as the primary classification: positive residual or unsupported encoded feasibility yields high claim risk; zero residual plus encoded feasibility but no recorded certificate yields moderate claim risk; zero residual plus encoded feasibility plus recorded enumeration or solver route yields low encoded-claim risk. The numeric score is retained only as a secondary audit index, and cgc_claim_risk_sensitivity.csv reports baseline, residual-heavy, certificate-heavy, and feasibility-heavy weight sets.</w:t>
       </w:r>
       <w:r>
         <w:t xml:space="preserve"> </w:t>
@@ -1299,22 +1217,7 @@
         <w:rPr>
           <w:color w:val="auto"/>
         </w:rPr>
-        <w:lastRenderedPageBreak/>
-        <w:t xml:space="preserve">S4. Independent </w:t>
-      </w:r>
-      <w:proofErr w:type="spellStart"/>
-      <w:r>
-        <w:rPr>
-          <w:color w:val="auto"/>
-        </w:rPr>
-        <w:t>OpenSeesPy</w:t>
-      </w:r>
-      <w:proofErr w:type="spellEnd"/>
-      <w:r>
-        <w:rPr>
-          <w:color w:val="auto"/>
-        </w:rPr>
-        <w:t xml:space="preserve"> blind FEM cross-check</w:t>
+        <w:t>S4. Independent OpenSeesPy blind FEM cross-check</w:t>
       </w:r>
     </w:p>
     <w:p>
@@ -1322,23 +1225,7 @@
         <w:spacing w:line="480" w:lineRule="auto"/>
       </w:pPr>
       <w:r>
-        <w:t xml:space="preserve">The independent </w:t>
-      </w:r>
-      <w:proofErr w:type="spellStart"/>
-      <w:r>
-        <w:t>OpenSeesPy</w:t>
-      </w:r>
-      <w:proofErr w:type="spellEnd"/>
-      <w:r>
-        <w:t xml:space="preserve"> </w:t>
-      </w:r>
-      <w:proofErr w:type="gramStart"/>
-      <w:r>
-        <w:t>cross-check</w:t>
-      </w:r>
-      <w:proofErr w:type="gramEnd"/>
-      <w:r>
-        <w:t xml:space="preserve"> evaluates 45 cases with a separate finite-element implementation. The result file reports zero classification mismatches and numerical differences at round-off scale, supporting the structural evaluator used in the certification workflow.</w:t>
+        <w:t>The independent OpenSeesPy cross-check evaluates 45 cases with a separate finite-element implementation. The result file reports zero classification mismatches and numerical differences at round-off scale, supporting the structural evaluator used in the certification workflow.</w:t>
       </w:r>
     </w:p>
     <w:p>
@@ -1358,18 +1245,27 @@
     </w:p>
     <w:p>
       <w:pPr>
+        <w:pStyle w:val="Heading1"/>
         <w:spacing w:line="480" w:lineRule="auto"/>
+        <w:rPr>
+          <w:rFonts w:ascii="Times New Roman" w:eastAsiaTheme="minorEastAsia" w:hAnsi="Times New Roman" w:cstheme="minorBidi"/>
+          <w:b w:val="0"/>
+          <w:bCs w:val="0"/>
+          <w:color w:val="auto"/>
+          <w:sz w:val="22"/>
+          <w:szCs w:val="22"/>
+        </w:rPr>
       </w:pPr>
       <w:r>
-        <w:t xml:space="preserve">The AISC benchmark is an optional external-data benchmark. The AISC spreadsheet </w:t>
-      </w:r>
-      <w:proofErr w:type="gramStart"/>
-      <w:r>
-        <w:t>is not redistributed</w:t>
-      </w:r>
-      <w:proofErr w:type="gramEnd"/>
-      <w:r>
-        <w:t xml:space="preserve"> in the clean ZIP; users must obtain the official spreadsheet and place it at the documented path. The local audit used 289 W-shapes, producing 83,521 member-pair candidates and 37,156 feasible candidates under the declared simplified loads and encoded limits. This supports only an AISC W-shape catalog audit under declared assumptions, not AISC approval, professional certification, comprehensive experimental validation, or full building-code translation.</w:t>
+        <w:rPr>
+          <w:rFonts w:ascii="Times New Roman" w:eastAsiaTheme="minorEastAsia" w:hAnsi="Times New Roman" w:cstheme="minorBidi"/>
+          <w:b w:val="0"/>
+          <w:bCs w:val="0"/>
+          <w:color w:val="auto"/>
+          <w:sz w:val="22"/>
+          <w:szCs w:val="22"/>
+        </w:rPr>
+        <w:t>The AISC benchmark is an optional external-data benchmark. The AISC spreadsheet is not redistributed in the clean ZIP; users must obtain the official spreadsheet and place it at the documented path. The local audit used 289 W-shapes, producing 83,521 member-pair candidates and 37,156 feasible candidates under the declared simplified loads and encoded limits. The file cgc_aisc_source_traceability.csv reports the local spreadsheet SHA256 used for verification, the benchmark-output SHA256, shape count, candidate count, feasible count, and best feasible W-shape pair. This supports only an AISC W-shape catalog audit under declared assumptions, not AISC approval, professional certification, comprehensive experimental validation, or full building-code translation.</w:t>
       </w:r>
     </w:p>
     <w:p>
@@ -1392,15 +1288,7 @@
         <w:spacing w:line="480" w:lineRule="auto"/>
       </w:pPr>
       <w:r>
-        <w:t xml:space="preserve">Proposition S1, encoded-compliance certificate: if all declared encoded residuals are non-positive within tolerance, catalog membership is valid, and the verification route </w:t>
-      </w:r>
-      <w:proofErr w:type="gramStart"/>
-      <w:r>
-        <w:t>is recorded</w:t>
-      </w:r>
-      <w:proofErr w:type="gramEnd"/>
-      <w:r>
-        <w:t>, the design supports only the corresponding encoded-compliance claim.</w:t>
+        <w:t>Proposition S1, encoded-compliance certificate: if all declared encoded residuals are non-positive within tolerance, catalog membership is valid, and the verification route is recorded, the design supports only the corresponding encoded-compliance claim.</w:t>
       </w:r>
     </w:p>
     <w:p>
@@ -1408,15 +1296,7 @@
         <w:spacing w:line="480" w:lineRule="auto"/>
       </w:pPr>
       <w:r>
-        <w:t xml:space="preserve">Proposition S2, finite-catalog optimality certificate: if every member of a finite declared catalog set </w:t>
-      </w:r>
-      <w:proofErr w:type="gramStart"/>
-      <w:r>
-        <w:t>is evaluated</w:t>
-      </w:r>
-      <w:proofErr w:type="gramEnd"/>
-      <w:r>
-        <w:t xml:space="preserve"> and the selected candidate has the minimum objective among feasible candidates, optimality is certified only over that finite enumerated set.</w:t>
+        <w:t>Proposition S2, finite-catalog optimality certificate: if every member of a finite declared catalog set is evaluated and the selected candidate has the minimum objective among feasible candidates, optimality is certified only over that finite enumerated set.</w:t>
       </w:r>
     </w:p>
     <w:p>
@@ -1439,7 +1319,6 @@
         <w:rPr>
           <w:color w:val="auto"/>
         </w:rPr>
-        <w:lastRenderedPageBreak/>
         <w:t>S7. Monte Carlo robustness boundary probe</w:t>
       </w:r>
     </w:p>
@@ -1448,15 +1327,7 @@
         <w:spacing w:line="480" w:lineRule="auto"/>
       </w:pPr>
       <w:r>
-        <w:t xml:space="preserve">The robustness probe perturbs load and elastic modulus by +/-10% over 2,000 samples per design. The nominal exact design had feasible rate 0.5515 and the near-boundary design had feasible rate 0.3675. These results deliberately prevent nominal encoded feasibility from </w:t>
-      </w:r>
-      <w:proofErr w:type="gramStart"/>
-      <w:r>
-        <w:t>being overstated</w:t>
-      </w:r>
-      <w:proofErr w:type="gramEnd"/>
-      <w:r>
-        <w:t xml:space="preserve"> as a robust-design-support claim.</w:t>
+        <w:t>The robustness probe perturbs load and elastic modulus by +/-10% over 2,000 samples per design. The nominal exact design had feasible rate 0.5515 and the near-boundary design had feasible rate 0.3675. These results deliberately prevent nominal encoded feasibility from being overstated as a robust-design-support claim.</w:t>
       </w:r>
     </w:p>
     <w:p>
@@ -1485,15 +1356,7 @@
         <w:t xml:space="preserve">ementary evidence. </w:t>
       </w:r>
       <w:r>
-        <w:t xml:space="preserve">Table S4 summarizes how the supplementary package aligns reporting items with the locations where they </w:t>
-      </w:r>
-      <w:proofErr w:type="gramStart"/>
-      <w:r>
-        <w:t>are addressed</w:t>
-      </w:r>
-      <w:proofErr w:type="gramEnd"/>
-      <w:r>
-        <w:t xml:space="preserve"> in the manuscript and supporting files.</w:t>
+        <w:t>Table S4 summarizes how the supplementary package aligns reporting items with the locations where they are addressed in the manuscript and supporting files.</w:t>
       </w:r>
     </w:p>
     <w:p>
@@ -1618,6 +1481,8 @@
               <w:spacing w:line="480" w:lineRule="auto"/>
               <w:rPr>
                 <w:b w:val="0"/>
+                <w:color w:val="000000"/>
+                <w:sz w:val="18"/>
               </w:rPr>
             </w:pPr>
             <w:r>
@@ -1626,8 +1491,16 @@
                 <w:color w:val="000000"/>
                 <w:sz w:val="18"/>
               </w:rPr>
-              <w:t>Validation and reproducibility</w:t>
+              <w:t>Verification, response-support sensitivity, and reproducibility</w:t>
             </w:r>
+          </w:p>
+          <w:p>
+            <w:pPr>
+              <w:spacing w:line="480" w:lineRule="auto"/>
+              <w:rPr>
+                <w:b w:val="0"/>
+              </w:rPr>
+            </w:pPr>
           </w:p>
         </w:tc>
         <w:tc>
@@ -1638,23 +1511,24 @@
             <w:pPr>
               <w:spacing w:line="480" w:lineRule="auto"/>
               <w:cnfStyle w:val="000000000000" w:firstRow="0" w:lastRow="0" w:firstColumn="0" w:lastColumn="0" w:oddVBand="0" w:evenVBand="0" w:oddHBand="0" w:evenHBand="0" w:firstRowFirstColumn="0" w:firstRowLastColumn="0" w:lastRowFirstColumn="0" w:lastRowLastColumn="0"/>
+              <w:rPr>
+                <w:color w:val="000000"/>
+                <w:sz w:val="18"/>
+              </w:rPr>
             </w:pPr>
-            <w:proofErr w:type="spellStart"/>
             <w:r>
               <w:rPr>
                 <w:color w:val="000000"/>
                 <w:sz w:val="18"/>
               </w:rPr>
-              <w:t>OpenSeesPy</w:t>
+              <w:t>OpenSeesPy cross-check, AISC optional audit and traceability, threshold-sensitivity table, run_all.py --quick/--smoke, README, requirements.txt</w:t>
             </w:r>
-            <w:proofErr w:type="spellEnd"/>
-            <w:r>
-              <w:rPr>
-                <w:color w:val="000000"/>
-                <w:sz w:val="18"/>
-              </w:rPr>
-              <w:t xml:space="preserve"> cross-check, AISC optional audit, run_all.py, README, requirements.txt</w:t>
-            </w:r>
+          </w:p>
+          <w:p>
+            <w:pPr>
+              <w:spacing w:line="480" w:lineRule="auto"/>
+              <w:cnfStyle w:val="000000000000" w:firstRow="0" w:lastRow="0" w:firstColumn="0" w:lastColumn="0" w:oddVBand="0" w:evenVBand="0" w:oddHBand="0" w:evenHBand="0" w:firstRowFirstColumn="0" w:firstRowLastColumn="0" w:lastRowFirstColumn="0" w:lastRowLastColumn="0"/>
+            </w:pPr>
           </w:p>
         </w:tc>
       </w:tr>
@@ -1766,27 +1640,19 @@
         <w:spacing w:line="480" w:lineRule="auto"/>
       </w:pPr>
       <w:r>
-        <w:t xml:space="preserve">The file </w:t>
-      </w:r>
-      <w:proofErr w:type="spellStart"/>
-      <w:r>
-        <w:t>cgc_certificate_handoff_schema.json</w:t>
-      </w:r>
-      <w:proofErr w:type="spellEnd"/>
-      <w:r>
-        <w:t xml:space="preserve"> provides a structured example of the information that a residual-evidence claim passport should pass to downstream verification environments: geometry, assigned catalog sections, encoded residual checks, declared exclusions, verification route, and intended </w:t>
+        <w:t xml:space="preserve">The file cgc_certificate_handoff_schema.json provides a structured example of the information that a residual-evidence claim passport should pass to downstream verification environments: geometry, assigned catalog sections, encoded residual checks, declared exclusions, verification route, and intended handoff targets. The schema is deliberately not presented as evidence of </w:t>
       </w:r>
       <w:r>
-        <w:lastRenderedPageBreak/>
-        <w:t xml:space="preserve">handoff targets. The schema </w:t>
+        <w:t>completed external response validation</w:t>
       </w:r>
-      <w:proofErr w:type="gramStart"/>
       <w:r>
-        <w:t>is deliberately not presented</w:t>
+        <w:t xml:space="preserve"> or clause-complete code support. Its role is to make the transition from optimization audit to later nonlinear virtual testing, commercial design-engine checking, or </w:t>
       </w:r>
-      <w:proofErr w:type="gramEnd"/>
       <w:r>
-        <w:t xml:space="preserve"> as evidence of completed physical validation or clause-complete code support. Its role is to make the transition from optimization audit to later nonlinear virtual testing, commercial design-engine checking, or physical laboratory planning explicit and reproducible.</w:t>
+        <w:t>laboratory-response planning</w:t>
+      </w:r>
+      <w:r>
+        <w:t xml:space="preserve"> explicit and reproducible.</w:t>
       </w:r>
     </w:p>
     <w:p>
@@ -1808,7 +1674,13 @@
         <w:rPr>
           <w:color w:val="auto"/>
         </w:rPr>
-        <w:t>S10. Code-and-physics validation extension</w:t>
+        <w:t xml:space="preserve">S10. </w:t>
+      </w:r>
+      <w:r>
+        <w:rPr>
+          <w:color w:val="auto"/>
+        </w:rPr>
+        <w:t>Code-and-response support extension</w:t>
       </w:r>
     </w:p>
     <w:p/>
@@ -1817,15 +1689,13 @@
         <w:spacing w:line="480" w:lineRule="auto"/>
       </w:pPr>
       <w:r>
-        <w:t xml:space="preserve">The files cgc_full_code_clause_register.csv, cgc_full_code_validation_oracle_comparison.py, cgc_portal_frame_full_code_validation.py, cgc_extended_claim_risk_benchmark.py, and cgc_full_code_aisc_validator.py add explicit code-validation status fields to the benchmark report. The </w:t>
+        <w:t xml:space="preserve">The files cgc_full_code_clause_register.csv, cgc_full_code_validation_oracle_comparison.py, cgc_portal_frame_full_code_validation.py, cgc_extended_claim_risk_benchmark.py, and </w:t>
       </w:r>
-      <w:proofErr w:type="gramStart"/>
       <w:r>
-        <w:t>current status</w:t>
+        <w:t>cgc_aisc_claim_gate.py</w:t>
       </w:r>
-      <w:proofErr w:type="gramEnd"/>
       <w:r>
-        <w:t xml:space="preserve"> is partial code-oracle support for declared simplified checks, not full ASCE/AISC approval. A full-code-check-supported claim would require clause-complete coverage for the declared code editions, load combinations, member types, and connection/detailing assumptions, plus independent oracle agreement.</w:t>
+        <w:t xml:space="preserve"> add explicit code-validation status fields to the benchmark report. The current status is partial code-oracle support for declared simplified checks, not full ASCE/AISC approval. A full-code-check-supported claim would require clause-complete coverage for the declared code editions, load combinations, member types, and connection/detailing assumptions, plus independent oracle agreement.</w:t>
       </w:r>
     </w:p>
     <w:p>
@@ -1833,7 +1703,19 @@
         <w:spacing w:line="480" w:lineRule="auto"/>
       </w:pPr>
       <w:r>
-        <w:t>The evidence ladder is L0 optimization-result only; L1 encoded-compliance support; L2 load-code-supported support; L3 clause-complete code-check-supported support; L4 published physical-response support within a declared structural class and loading protocol; and L5 engineering approval. L5 is outside the paper. L3 and L4 are admissible only when the corresponding oracle and physical-response evidence files report passing status.</w:t>
+        <w:t xml:space="preserve">The evidence ladder is L0 optimization-result only; L1 encoded-compliance support; L2 load-code-supported support; L3 clause-complete code-check-supported support; L4 </w:t>
+      </w:r>
+      <w:r>
+        <w:t>published-response support</w:t>
+      </w:r>
+      <w:r>
+        <w:t xml:space="preserve"> within a declared structural class and loading protocol; and L5 engineering approval. L5 is outside the paper. L3 and L4 are admissible only when the corresponding oracle and </w:t>
+      </w:r>
+      <w:r>
+        <w:t>published-response</w:t>
+      </w:r>
+      <w:r>
+        <w:t xml:space="preserve"> evidence files report passing status.</w:t>
       </w:r>
     </w:p>
     <w:p>
@@ -1841,67 +1723,13 @@
         <w:spacing w:line="480" w:lineRule="auto"/>
       </w:pPr>
       <w:r>
-        <w:lastRenderedPageBreak/>
-        <w:t xml:space="preserve">The supplementary file cgc_code_physics_validation_extension.md records this ladder, required evidence, current package status, </w:t>
+        <w:t xml:space="preserve">The supplementary file cgc_code_physics_validation_extension.md records this ladder, required evidence, current package status, and blocked overclaim examples so that reviewers can distinguish encoded feasibility, partial code-oracle support, clause-complete code-check support, and </w:t>
       </w:r>
-      <w:proofErr w:type="gramStart"/>
       <w:r>
-        <w:t>and blocked</w:t>
+        <w:t>published-response support</w:t>
       </w:r>
-      <w:proofErr w:type="gramEnd"/>
       <w:r>
-        <w:t xml:space="preserve"> </w:t>
-      </w:r>
-      <w:proofErr w:type="spellStart"/>
-      <w:r>
-        <w:t>overclaim</w:t>
-      </w:r>
-      <w:proofErr w:type="spellEnd"/>
-      <w:r>
-        <w:t xml:space="preserve"> examples so that reviewers can distinguish encoded feasibility, partial code-oracle support, clause-complete code-check support, and published physical-response support.</w:t>
-      </w:r>
-    </w:p>
-    <w:p>
-      <w:pPr>
-        <w:spacing w:line="480" w:lineRule="auto"/>
-        <w:rPr>
-          <w:sz w:val="24"/>
-        </w:rPr>
-      </w:pPr>
-      <w:r>
-        <w:t xml:space="preserve">The files cgc_portal_frame_published_test_register.csv, cgc_portal_frame_experimental_response.csv, cgc_portal_frame_physical_validation.py, cgc_portal_frame_physical_validation_summary.csv, cgc_portal_frame_physical_validation_details.csv, cgc_portal_frame_raw_data_manifest.csv, and cgc_portal_frame_raw_data_acquisition_note.md add a limited published physical-response support layer. The raw </w:t>
-      </w:r>
-      <w:proofErr w:type="spellStart"/>
-      <w:r>
-        <w:t>DesignSafe</w:t>
-      </w:r>
-      <w:proofErr w:type="spellEnd"/>
-      <w:r>
-        <w:t xml:space="preserve">/NEES SAC Steel Project Experiment 5 files are stored outside the submission ZIP in the local/Drive raw-data folder, while the processed service-envelope points are included in the ZIP. The script screens ten raw cyclic response curves, accepts seven specimens under the declared service-response and initial-stiffness tolerances, logs three failed or insufficient cases, and reports </w:t>
-      </w:r>
-      <w:proofErr w:type="spellStart"/>
-      <w:r>
-        <w:t>false_certified_count</w:t>
-      </w:r>
-      <w:proofErr w:type="spellEnd"/>
-      <w:r>
-        <w:t xml:space="preserve"> = 0. The resulting </w:t>
-      </w:r>
-      <w:proofErr w:type="spellStart"/>
-      <w:r>
-        <w:t>physical_validation_status</w:t>
-      </w:r>
-      <w:proofErr w:type="spellEnd"/>
-      <w:r>
-        <w:t xml:space="preserve"> is </w:t>
-      </w:r>
-      <w:proofErr w:type="spellStart"/>
-      <w:r>
-        <w:t>validated_against_published_data</w:t>
-      </w:r>
-      <w:proofErr w:type="spellEnd"/>
-      <w:r>
-        <w:t xml:space="preserve"> for the tested steel-frame response family only; it is not safety certification, AISC approval, professional certification, or complete regulatory approval.</w:t>
+        <w:t>.</w:t>
       </w:r>
     </w:p>
     <w:p>
@@ -1909,31 +1737,31 @@
         <w:spacing w:line="480" w:lineRule="auto"/>
       </w:pPr>
       <w:r>
-        <w:t xml:space="preserve">The files cgc_truss_published_test_register.csv, cgc_truss_experimental_response.csv, cgc_truss_physical_validation.py, cgc_truss_physical_validation_summary.csv, cgc_truss_physical_validation_details.csv, cgc_truss_raw_data_manifest.csv, and cgc_truss_raw_data_acquisition_note.md add a limited published truss physical-response support layer. The raw </w:t>
+        <w:t>The files cgc_portal_frame_published_test_register.csv, cgc_portal_frame_experimental_response.csv, cgc_portal_frame_response_support.py, cgc_portal_frame_response_support_summary.csv, cgc_portal_frame_response_support_details.csv, cgc_response_support_threshold_sensitivity.csv, cgc_portal_frame_raw_data_manifest.csv, and cgc_portal_frame_raw_data_acquisition_note.md add a limited published-response support layer. The raw DesignSafe/NEES SAC Steel Project Experiment 5 files are stored outside the submission ZIP in the local/Drive raw-data folder, while the processed service-envelope points are included in the ZIP. The script screens ten raw cyclic response curves, accepts seven specimens under the declared service-response and initial-stiffness tolerances, logs three failed or insufficient cases, and reports false_certified_count = 0. The sensitivity table reports how the passing count changes under NRMSE limits 0.10/0.15/0.20 and stiffness-error limits 0.15/0.20/0.25. The resulting response_support_status is supported_by_processed_published_response_data for the tested steel-frame response family only; it is not safety certification, AISC approval, professional certification, or complete regulatory approval.</w:t>
       </w:r>
-      <w:proofErr w:type="spellStart"/>
+    </w:p>
+    <w:p>
+      <w:pPr>
+        <w:pStyle w:val="Heading1"/>
+        <w:rPr>
+          <w:rFonts w:ascii="Times New Roman" w:eastAsiaTheme="minorEastAsia" w:hAnsi="Times New Roman" w:cstheme="minorBidi"/>
+          <w:b w:val="0"/>
+          <w:bCs w:val="0"/>
+          <w:color w:val="auto"/>
+          <w:sz w:val="22"/>
+          <w:szCs w:val="22"/>
+        </w:rPr>
+      </w:pPr>
       <w:r>
-        <w:t>Zenodo</w:t>
-      </w:r>
-      <w:proofErr w:type="spellEnd"/>
-      <w:r>
-        <w:t xml:space="preserve"> workbook 10.5281/zenodo.15658671 is included inside the submission ZIP under </w:t>
-      </w:r>
-      <w:proofErr w:type="spellStart"/>
-      <w:r>
-        <w:t>external_raw_datasets</w:t>
-      </w:r>
-      <w:proofErr w:type="spellEnd"/>
-      <w:r>
-        <w:t xml:space="preserve">/Zenodo_15658671_SteelTruss/ because it is distributed under Creative Commons Attribution 4.0 International. The module screens seven truss damage/collapse cases against intact-state sensor baselines, accepts six under the declared detection rule, logs one discrepancy, and reports </w:t>
-      </w:r>
-      <w:proofErr w:type="spellStart"/>
-      <w:r>
-        <w:t>false_certified_count</w:t>
-      </w:r>
-      <w:proofErr w:type="spellEnd"/>
-      <w:r>
-        <w:t xml:space="preserve"> = 0.</w:t>
+        <w:rPr>
+          <w:rFonts w:ascii="Times New Roman" w:eastAsiaTheme="minorEastAsia" w:hAnsi="Times New Roman" w:cstheme="minorBidi"/>
+          <w:b w:val="0"/>
+          <w:bCs w:val="0"/>
+          <w:color w:val="auto"/>
+          <w:sz w:val="22"/>
+          <w:szCs w:val="22"/>
+        </w:rPr>
+        <w:t>The files cgc_truss_published_test_register.csv, cgc_truss_experimental_response.csv, cgc_truss_response_support.py, cgc_truss_response_support_summary.csv, cgc_truss_response_support_details.csv, cgc_response_support_threshold_sensitivity.csv, cgc_truss_raw_data_manifest.csv, and cgc_truss_raw_data_acquisition_note.md add a limited published truss published-response support layer. The raw Zenodo workbook 10.5281/zenodo.15658671 is included inside the submission ZIP under external_raw_datasets/Zenodo_15658671_SteelTruss/ because it is distributed under Creative Commons Attribution 4.0 International. The module screens seven truss damage/collapse cases against intact-state sensor baselines, accepts six under the declared detection rule, logs one discrepancy, and reports false_certified_count = 0. The sensitivity table reports the passing count under detection-rate limits 0.45/0.50/0.55.</w:t>
       </w:r>
     </w:p>
     <w:p>
@@ -1947,7 +1775,6 @@
         <w:rPr>
           <w:color w:val="auto"/>
         </w:rPr>
-        <w:lastRenderedPageBreak/>
         <w:t>S11. Reviewer-facing claim-status controls</w:t>
       </w:r>
     </w:p>
@@ -1957,23 +1784,7 @@
         <w:spacing w:line="480" w:lineRule="auto"/>
       </w:pPr>
       <w:r>
-        <w:t xml:space="preserve">The final supplementary package adds reviewer-facing controls that test whether the framework blocks unsupported wording rather than merely accepting residual-zero cases. The file cgc_claim_status_by_evidence_layer.csv records the evidence layer supporting each benchmark claim. The negative-control claim test deliberately introduces off-catalog sections, positive residuals, missing verification routes, AISC-approval wording without code-clause evidence, and robust wording without robust-design evidence; all cases are blocked or downgraded and </w:t>
-      </w:r>
-      <w:proofErr w:type="spellStart"/>
-      <w:r>
-        <w:t>false_certified_count</w:t>
-      </w:r>
-      <w:proofErr w:type="spellEnd"/>
-      <w:r>
-        <w:t xml:space="preserve"> remains </w:t>
-      </w:r>
-      <w:proofErr w:type="gramStart"/>
-      <w:r>
-        <w:t>0</w:t>
-      </w:r>
-      <w:proofErr w:type="gramEnd"/>
-      <w:r>
-        <w:t>. The manual oracle check compares 18 hand-calculation cases for drift, demand/capacity, strong-column/weak-beam, shear hierarchy, catalog membership, and residual sign convention, with zero classification mismatches. The file cgc_reviewer_claim_audit_checklist.md maps likely reviewer questions to the exact supplementary artifact that answers each question.</w:t>
+        <w:t>The final supplementary package adds reviewer-facing controls that test whether the framework blocks unsupported wording rather than merely accepting residual-zero cases. The file cgc_claim_status_by_evidence_layer.csv records the evidence layer supporting each benchmark claim. The negative-control claim test deliberately introduces off-catalog sections, positive residuals, missing verification routes, AISC-approval wording without code-clause evidence, and robust wording without robust-design evidence; all cases are blocked or downgraded and false_certified_count remains 0. The manual oracle check compares 18 hand-calculation cases for drift, demand/capacity, strong-column/weak-beam, shear hierarchy, catalog membership, and residual sign convention, with zero classification mismatches. The file cgc_reviewer_claim_audit_checklist.md maps likely reviewer questions to the exact supplementary artifact that answers each question.</w:t>
       </w:r>
     </w:p>
     <w:p>
@@ -1987,7 +1798,19 @@
         <w:rPr>
           <w:color w:val="auto"/>
         </w:rPr>
-        <w:t>S12. Software full-stack validation.</w:t>
+        <w:t xml:space="preserve">S12. </w:t>
+      </w:r>
+      <w:r>
+        <w:rPr>
+          <w:color w:val="auto"/>
+        </w:rPr>
+        <w:t>Software-package integrity</w:t>
+      </w:r>
+      <w:r>
+        <w:rPr>
+          <w:color w:val="auto"/>
+        </w:rPr>
+        <w:t>.</w:t>
       </w:r>
     </w:p>
     <w:p/>
@@ -1996,39 +1819,7 @@
         <w:spacing w:line="480" w:lineRule="auto"/>
       </w:pPr>
       <w:r>
-        <w:t xml:space="preserve">The files cgc_software_full_stack_validation.py, cgc_software_full_stack_validation_details.csv, cgc_software_full_stack_validation_summary.csv, and cgc_software_full_stack_validation_note.txt validate the reproducibility package across presentation, application, data, and integration layers. The validator compiles all package Python scripts, checks required entry points, verifies critical CSV schemas and processed datasets, confirms ZIP exclusions and upload-package hash consistency, and writes </w:t>
-      </w:r>
-      <w:proofErr w:type="spellStart"/>
-      <w:r>
-        <w:t>software_full_stack_validation_status</w:t>
-      </w:r>
-      <w:proofErr w:type="spellEnd"/>
-      <w:r>
-        <w:t xml:space="preserve"> back to cgc_benchmark_reporting_summary.csv. A passed result authorizes only software full-stack validation of the reproducibility package; it is not structural-code approval, professional approval, legal approval, or complete regulatory approval. The validator also confirms that the redistributable </w:t>
-      </w:r>
-      <w:proofErr w:type="spellStart"/>
-      <w:r>
-        <w:t>Zenodo</w:t>
-      </w:r>
-      <w:proofErr w:type="spellEnd"/>
-      <w:r>
-        <w:t xml:space="preserve"> raw workbook and the </w:t>
-      </w:r>
-      <w:proofErr w:type="spellStart"/>
-      <w:r>
-        <w:t>vendored</w:t>
-      </w:r>
-      <w:proofErr w:type="spellEnd"/>
-      <w:r>
-        <w:t xml:space="preserve"> </w:t>
-      </w:r>
-      <w:proofErr w:type="spellStart"/>
-      <w:r>
-        <w:t>PuLP</w:t>
-      </w:r>
-      <w:proofErr w:type="spellEnd"/>
-      <w:r>
-        <w:t>/CBC license note are present when the full package is checked.</w:t>
+        <w:t>The files cgc_software_package_integrity.py, cgc_software_package_integrity_details.csv, cgc_software_package_integrity_summary.csv, and cgc_software_package_integrity_note.txt check the reproducibility package across presentation, application, data, and integration layers. The checker compiles package Python scripts, checks required entry points, verifies critical CSV schemas and processed datasets, confirms ZIP exclusions and upload-package hash consistency, and writes software_package_integrity_status back to cgc_benchmark_reporting_summary.csv. A passed result authorizes only software-package integrity of the reproducibility package; it is not structural-code approval, professional approval, legal approval, or complete regulatory approval. The checker also confirms that the redistributable Zenodo raw workbook, response-support threshold-sensitivity table, AISC traceability table, and vendored PuLP/CBC license note are present when the full package is checked.</w:t>
       </w:r>
     </w:p>
     <w:p>
@@ -2036,33 +1827,13 @@
         <w:spacing w:line="480" w:lineRule="auto"/>
       </w:pPr>
       <w:r>
-        <w:lastRenderedPageBreak/>
-        <w:t xml:space="preserve">Third-party raw-data redistribution note. The file third_party_raw_data_redistribution_note.md summarizes why some third-party raw datasets are included while others are not. The </w:t>
+        <w:t>Third-party raw-data redistribution note. The file third_party_raw_data_redistribution_note.md summarizes why some third-party raw datasets are included while others are not. The Zenodo truss workbook is redistributed because the source record declares CC BY 4.0 licensing. The DesignSafe/NEES portal-frame raw files and the AISC Shapes Database spreadsheet are not redistributed because open redistribution permission was not confirmed for those third-party resources; the package therefore includes processed response-support points, source manifests, acquisition notes, AISC source/output checksums, and rerun instructions instead.</w:t>
       </w:r>
-      <w:proofErr w:type="spellStart"/>
-      <w:r>
-        <w:t>Zenodo</w:t>
-      </w:r>
-      <w:proofErr w:type="spellEnd"/>
-      <w:r>
-        <w:t xml:space="preserve"> truss workbook </w:t>
-      </w:r>
-      <w:proofErr w:type="gramStart"/>
-      <w:r>
-        <w:t>is redistributed</w:t>
-      </w:r>
-      <w:proofErr w:type="gramEnd"/>
-      <w:r>
-        <w:t xml:space="preserve"> because the source record declares CC BY 4.0 licensing. The </w:t>
-      </w:r>
-      <w:proofErr w:type="spellStart"/>
-      <w:r>
-        <w:t>DesignSafe</w:t>
-      </w:r>
-      <w:proofErr w:type="spellEnd"/>
-      <w:r>
-        <w:t>/NEES portal-frame raw files and the AISC Shapes Database spreadsheet are not redistributed because open redistribution permission was not confirmed for those third-party resources; the package therefore includes processed validation points, manifests, acquisition notes, and rerun instructions instead.</w:t>
-      </w:r>
+    </w:p>
+    <w:p>
+      <w:pPr>
+        <w:spacing w:line="480" w:lineRule="auto"/>
+      </w:pPr>
     </w:p>
     <w:sectPr>
       <w:pgSz w:w="12240" w:h="15840"/>
@@ -14075,7 +13846,7 @@
 </file>
 
 <file path=customXml/itemProps1.xml><?xml version="1.0" encoding="utf-8"?>
-<ds:datastoreItem xmlns:ds="http://schemas.openxmlformats.org/officeDocument/2006/customXml" ds:itemID="{C68888E2-864D-4637-829B-BD0BC70DF32F}">
+<ds:datastoreItem xmlns:ds="http://schemas.openxmlformats.org/officeDocument/2006/customXml" ds:itemID="{024F3889-A5DA-49D9-BD27-A4CFD48BC69C}">
   <ds:schemaRefs>
     <ds:schemaRef ds:uri="http://schemas.openxmlformats.org/officeDocument/2006/bibliography"/>
   </ds:schemaRefs>

</xml_diff>

<commit_message>
Reduce supplementary archive size
</commit_message>
<xml_diff>
--- a/supplementary/Supplementary_Material.docx
+++ b/supplementary/Supplementary_Material.docx
@@ -25,19 +25,7 @@
         <w:spacing w:line="480" w:lineRule="auto"/>
       </w:pPr>
       <w:r>
-        <w:t xml:space="preserve">Public repository: </w:t>
-      </w:r>
-      <w:r>
-        <w:t>https://github.com/gabrielmontufar/article-114-optimization-and-engineering-claim-admissibility</w:t>
-      </w:r>
-      <w:r>
-        <w:t xml:space="preserve">. This repository contains this supplementary Word document, the submitted reproducibility archive, and the public-facing README for the article 114 Optimization and Engineering package. Third-party raw datasets are included only when redistribution permission is confirmed; otherwise the repository provides </w:t>
-      </w:r>
-      <w:r>
-        <w:t>processed response-support points</w:t>
-      </w:r>
-      <w:r>
-        <w:t>, manifests, acquisition notes, and acquisition instructions.</w:t>
+        <w:t>Public repository: https://github.com/gabrielmontufar/article-114-optimization-and-engineering-claim-admissibility. This repository contains this supplementary Word document, the submitted reproducibility archive, and the public-facing README for the article 114 Optimization and Engineering package. Third-party raw datasets are not bundled in the submission ZIP; the repository provides processed response-support points, manifests, acquisition notes, and acquisition instructions.</w:t>
       </w:r>
     </w:p>
     <w:p>
@@ -1761,7 +1749,7 @@
           <w:sz w:val="22"/>
           <w:szCs w:val="22"/>
         </w:rPr>
-        <w:t>The files cgc_truss_published_test_register.csv, cgc_truss_experimental_response.csv, cgc_truss_response_support.py, cgc_truss_response_support_summary.csv, cgc_truss_response_support_details.csv, cgc_response_support_threshold_sensitivity.csv, cgc_truss_raw_data_manifest.csv, and cgc_truss_raw_data_acquisition_note.md add a limited published truss published-response support layer. The raw Zenodo workbook 10.5281/zenodo.15658671 is included inside the submission ZIP under external_raw_datasets/Zenodo_15658671_SteelTruss/ because it is distributed under Creative Commons Attribution 4.0 International. The module screens seven truss damage/collapse cases against intact-state sensor baselines, accepts six under the declared detection rule, logs one discrepancy, and reports false_certified_count = 0. The sensitivity table reports the passing count under detection-rate limits 0.45/0.50/0.55.</w:t>
+        <w:t>The files cgc_truss_published_test_register.csv, cgc_truss_experimental_response.csv, cgc_truss_response_support.py, cgc_truss_response_support_summary.csv, cgc_truss_response_support_details.csv, cgc_response_support_threshold_sensitivity.csv, cgc_truss_raw_data_manifest.csv, and cgc_truss_raw_data_acquisition_note.md add a limited published truss published-response support layer. The public Zenodo workbook 10.5281/zenodo.15658671 is not bundled in the submission ZIP; the ZIP provides processed response points, a manifest, and acquisition instructions for optional raw-data reruns. The module screens seven truss damage/collapse cases against intact-state sensor baselines, accepts six under the declared detection rule, logs one discrepancy, and reports false_certified_count = 0. The sensitivity table reports the passing count under detection-rate limits 0.45/0.50/0.55.</w:t>
       </w:r>
     </w:p>
     <w:p>
@@ -13846,7 +13834,7 @@
 </file>
 
 <file path=customXml/itemProps1.xml><?xml version="1.0" encoding="utf-8"?>
-<ds:datastoreItem xmlns:ds="http://schemas.openxmlformats.org/officeDocument/2006/customXml" ds:itemID="{024F3889-A5DA-49D9-BD27-A4CFD48BC69C}">
+<ds:datastoreItem xmlns:ds="http://schemas.openxmlformats.org/officeDocument/2006/customXml" ds:itemID="{B394010D-D640-48E2-9E1A-39399CEB31F6}">
   <ds:schemaRefs>
     <ds:schemaRef ds:uri="http://schemas.openxmlformats.org/officeDocument/2006/bibliography"/>
   </ds:schemaRefs>

</xml_diff>

<commit_message>
Align supplementary resources with OPTE requirements
</commit_message>
<xml_diff>
--- a/supplementary/Supplementary_Material.docx
+++ b/supplementary/Supplementary_Material.docx
@@ -25,7 +25,7 @@
         <w:spacing w:line="480" w:lineRule="auto"/>
       </w:pPr>
       <w:r>
-        <w:t>Public repository: https://github.com/gabrielmontufar/article-114-optimization-and-engineering-claim-admissibility. This repository contains this supplementary Word document, the submitted reproducibility archive, and the public-facing README for the article 114 Optimization and Engineering package. Third-party raw datasets are not bundled in the submission ZIP; the repository provides processed response-support points, manifests, acquisition notes, and acquisition instructions.</w:t>
+        <w:t>Public repository: https://github.com/gabrielmontufar/article-114-optimization-and-engineering-claim-admissibility. This repository contains Online Resource 1, Online Resource 2, and the public-facing README for the article 114 Optimization and Engineering package. Third-party raw datasets are not bundled in Online Resource 2; the repository provides processed response-support points, manifests, acquisition notes, and acquisition instructions.</w:t>
       </w:r>
     </w:p>
     <w:p>
@@ -1677,13 +1677,13 @@
         <w:spacing w:line="480" w:lineRule="auto"/>
       </w:pPr>
       <w:r>
-        <w:t xml:space="preserve">The files cgc_full_code_clause_register.csv, cgc_full_code_validation_oracle_comparison.py, cgc_portal_frame_full_code_validation.py, cgc_extended_claim_risk_benchmark.py, and </w:t>
+        <w:t xml:space="preserve">The files cgc_full_code_clause_register.csv, cgc_partial_code_oracle_comparison.py, cgc_portal_frame_clause_support_gate.py, cgc_extended_claim_risk_benchmark.py, and </w:t>
       </w:r>
       <w:r>
         <w:t>cgc_aisc_claim_gate.py</w:t>
       </w:r>
       <w:r>
-        <w:t xml:space="preserve"> add explicit code-validation status fields to the benchmark report. The current status is partial code-oracle support for declared simplified checks, not full ASCE/AISC approval. A full-code-check-supported claim would require clause-complete coverage for the declared code editions, load combinations, member types, and connection/detailing assumptions, plus independent oracle agreement.</w:t>
+        <w:t xml:space="preserve"> add explicit clause-support and code-oracle status fields to the benchmark report. The current status is partial code-oracle support for declared simplified checks, not full ASCE/AISC approval. A full-code-check-supported claim would require clause-complete coverage for the declared code editions, load combinations, member types, and connection/detailing assumptions, plus independent oracle agreement.</w:t>
       </w:r>
     </w:p>
     <w:p>

</xml_diff>

<commit_message>
Align supplementary integrity wording
</commit_message>
<xml_diff>
--- a/supplementary/Supplementary_Material.docx
+++ b/supplementary/Supplementary_Material.docx
@@ -1807,7 +1807,13 @@
         <w:spacing w:line="480" w:lineRule="auto"/>
       </w:pPr>
       <w:r>
-        <w:t>The files cgc_software_package_integrity.py, cgc_software_package_integrity_details.csv, cgc_software_package_integrity_summary.csv, and cgc_software_package_integrity_note.txt check the reproducibility package across presentation, application, data, and integration layers. The checker compiles package Python scripts, checks required entry points, verifies critical CSV schemas and processed datasets, confirms ZIP exclusions and upload-package hash consistency, and writes software_package_integrity_status back to cgc_benchmark_reporting_summary.csv. A passed result authorizes only software-package integrity of the reproducibility package; it is not structural-code approval, professional approval, legal approval, or complete regulatory approval. The checker also confirms that processed response-support points, response-support threshold-sensitivity tables, AISC traceability outputs, acquisition notes for nonbundled raw sources, and package dependency instructions are present when the full package is checked.</w:t>
+        <w:t xml:space="preserve">The files cgc_software_package_integrity.py, cgc_software_package_integrity_details.csv, cgc_software_package_integrity_summary.csv, and cgc_software_package_integrity_note.txt check the reproducibility package across presentation, application, data, and integration layers. The checker compiles package Python scripts, checks required entry points, verifies critical CSV schemas and processed datasets, </w:t>
+      </w:r>
+      <w:r>
+        <w:t>confirms ZIP exclusions, records that the final upload ZIP SHA256 is handled in the delivery manifest to avoid self-hash recursion, and writes software_package_integrity_status back to cgc_benchmark_reporting_summary.csv.</w:t>
+      </w:r>
+      <w:r>
+        <w:t xml:space="preserve"> A passed result authorizes only software-package integrity of the reproducibility package; it is not structural-code approval, professional approval, legal approval, or complete regulatory approval. The checker also confirms that processed response-support points, response-support threshold-sensitivity tables, AISC traceability outputs, acquisition notes for nonbundled raw sources, and package dependency instructions are present when the full package is checked.</w:t>
       </w:r>
     </w:p>
     <w:p>
@@ -13834,7 +13840,7 @@
 </file>
 
 <file path=customXml/itemProps1.xml><?xml version="1.0" encoding="utf-8"?>
-<ds:datastoreItem xmlns:ds="http://schemas.openxmlformats.org/officeDocument/2006/customXml" ds:itemID="{B394010D-D640-48E2-9E1A-39399CEB31F6}">
+<ds:datastoreItem xmlns:ds="http://schemas.openxmlformats.org/officeDocument/2006/customXml" ds:itemID="{5C6A5CD3-E254-4D1F-98FD-086ABCAF23E9}">
   <ds:schemaRefs>
     <ds:schemaRef ds:uri="http://schemas.openxmlformats.org/officeDocument/2006/bibliography"/>
   </ds:schemaRefs>

</xml_diff>